<commit_message>
Apply HitRise September requirements
</commit_message>
<xml_diff>
--- a/hitrise-docs/HitRise_用户手册.docx
+++ b/hitrise-docs/HitRise_用户手册.docx
@@ -63,6 +63,10 @@
         <w:gridCol w:w="4989"/>
       </w:tblGrid>
       <w:tr>
+        <w:trPr>
+          <w:cantSplit/>
+          <w:tblHeader w:val="true"/>
+        </w:trPr>
         <w:tc>
           <w:tcPr>
             <w:tcW w:type="dxa" w:w="2438"/>
@@ -131,6 +135,9 @@
         </w:tc>
       </w:tr>
       <w:tr>
+        <w:trPr>
+          <w:cantSplit/>
+        </w:trPr>
         <w:tc>
           <w:tcPr>
             <w:tcW w:type="dxa" w:w="2438"/>
@@ -197,6 +204,9 @@
         </w:tc>
       </w:tr>
       <w:tr>
+        <w:trPr>
+          <w:cantSplit/>
+        </w:trPr>
         <w:tc>
           <w:tcPr>
             <w:tcW w:type="dxa" w:w="2438"/>
@@ -263,6 +273,9 @@
         </w:tc>
       </w:tr>
       <w:tr>
+        <w:trPr>
+          <w:cantSplit/>
+        </w:trPr>
         <w:tc>
           <w:tcPr>
             <w:tcW w:type="dxa" w:w="2438"/>
@@ -291,7 +304,7 @@
                 <w:color w:val="1A1F24"/>
                 <w:sz w:val="18"/>
               </w:rPr>
-              <w:t>产品码</w:t>
+              <w:t>产品认证</w:t>
             </w:r>
           </w:p>
         </w:tc>
@@ -323,12 +336,15 @@
                 <w:color w:val="1A1F24"/>
                 <w:sz w:val="18"/>
               </w:rPr>
-              <w:t>HTR01</w:t>
+              <w:t>无需产品序列号或激活码</w:t>
             </w:r>
           </w:p>
         </w:tc>
       </w:tr>
       <w:tr>
+        <w:trPr>
+          <w:cantSplit/>
+        </w:trPr>
         <w:tc>
           <w:tcPr>
             <w:tcW w:type="dxa" w:w="2438"/>
@@ -389,12 +405,15 @@
                 <w:color w:val="1A1F24"/>
                 <w:sz w:val="18"/>
               </w:rPr>
-              <w:t>1.1</w:t>
+              <w:t>1.2</w:t>
             </w:r>
           </w:p>
         </w:tc>
       </w:tr>
       <w:tr>
+        <w:trPr>
+          <w:cantSplit/>
+        </w:trPr>
         <w:tc>
           <w:tcPr>
             <w:tcW w:type="dxa" w:w="2438"/>
@@ -455,7 +474,7 @@
                 <w:color w:val="1A1F24"/>
                 <w:sz w:val="18"/>
               </w:rPr>
-              <w:t>2026-09-16</w:t>
+              <w:t>2026-09-21</w:t>
             </w:r>
           </w:p>
         </w:tc>
@@ -476,6 +495,9 @@
         <w:gridCol w:w="9978"/>
       </w:tblGrid>
       <w:tr>
+        <w:trPr>
+          <w:cantSplit/>
+        </w:trPr>
         <w:tc>
           <w:tcPr>
             <w:tcW w:type="dxa" w:w="9978"/>
@@ -535,6 +557,7 @@
     </w:p>
     <w:p>
       <w:pPr>
+        <w:keepNext/>
         <w:spacing w:before="200" w:after="160"/>
       </w:pPr>
       <w:r>
@@ -559,6 +582,10 @@
         <w:gridCol w:w="4989"/>
       </w:tblGrid>
       <w:tr>
+        <w:trPr>
+          <w:cantSplit/>
+          <w:tblHeader w:val="true"/>
+        </w:trPr>
         <w:tc>
           <w:tcPr>
             <w:tcW w:type="dxa" w:w="1134"/>
@@ -627,6 +654,9 @@
         </w:tc>
       </w:tr>
       <w:tr>
+        <w:trPr>
+          <w:cantSplit/>
+        </w:trPr>
         <w:tc>
           <w:tcPr>
             <w:tcW w:type="dxa" w:w="1134"/>
@@ -693,6 +723,9 @@
         </w:tc>
       </w:tr>
       <w:tr>
+        <w:trPr>
+          <w:cantSplit/>
+        </w:trPr>
         <w:tc>
           <w:tcPr>
             <w:tcW w:type="dxa" w:w="1134"/>
@@ -759,6 +792,9 @@
         </w:tc>
       </w:tr>
       <w:tr>
+        <w:trPr>
+          <w:cantSplit/>
+        </w:trPr>
         <w:tc>
           <w:tcPr>
             <w:tcW w:type="dxa" w:w="1134"/>
@@ -825,6 +861,9 @@
         </w:tc>
       </w:tr>
       <w:tr>
+        <w:trPr>
+          <w:cantSplit/>
+        </w:trPr>
         <w:tc>
           <w:tcPr>
             <w:tcW w:type="dxa" w:w="1134"/>
@@ -891,6 +930,9 @@
         </w:tc>
       </w:tr>
       <w:tr>
+        <w:trPr>
+          <w:cantSplit/>
+        </w:trPr>
         <w:tc>
           <w:tcPr>
             <w:tcW w:type="dxa" w:w="1134"/>
@@ -957,6 +999,9 @@
         </w:tc>
       </w:tr>
       <w:tr>
+        <w:trPr>
+          <w:cantSplit/>
+        </w:trPr>
         <w:tc>
           <w:tcPr>
             <w:tcW w:type="dxa" w:w="1134"/>
@@ -1023,6 +1068,9 @@
         </w:tc>
       </w:tr>
       <w:tr>
+        <w:trPr>
+          <w:cantSplit/>
+        </w:trPr>
         <w:tc>
           <w:tcPr>
             <w:tcW w:type="dxa" w:w="1134"/>
@@ -1089,6 +1137,9 @@
         </w:tc>
       </w:tr>
       <w:tr>
+        <w:trPr>
+          <w:cantSplit/>
+        </w:trPr>
         <w:tc>
           <w:tcPr>
             <w:tcW w:type="dxa" w:w="1134"/>
@@ -1155,6 +1206,9 @@
         </w:tc>
       </w:tr>
       <w:tr>
+        <w:trPr>
+          <w:cantSplit/>
+        </w:trPr>
         <w:tc>
           <w:tcPr>
             <w:tcW w:type="dxa" w:w="1134"/>
@@ -1246,6 +1300,7 @@
     </w:p>
     <w:p>
       <w:pPr>
+        <w:keepNext/>
         <w:spacing w:before="200" w:after="160"/>
       </w:pPr>
       <w:r>
@@ -1281,6 +1336,74 @@
         <w:gridCol w:w="9978"/>
       </w:tblGrid>
       <w:tr>
+        <w:trPr>
+          <w:cantSplit/>
+        </w:trPr>
+        <w:tc>
+          <w:tcPr>
+            <w:tcW w:type="dxa" w:w="9978"/>
+            <w:shd w:fill="E9FFF2"/>
+            <w:tcBorders>
+              <w:top w:val="single" w:sz="10" w:space="0" w:color="00A865"/>
+              <w:left w:val="single" w:sz="10" w:space="0" w:color="00A865"/>
+              <w:bottom w:val="single" w:sz="10" w:space="0" w:color="00A865"/>
+              <w:right w:val="single" w:sz="10" w:space="0" w:color="00A865"/>
+            </w:tcBorders>
+            <w:tcMar>
+              <w:top w:w="150" w:type="dxa"/>
+              <w:start w:w="170" w:type="dxa"/>
+              <w:bottom w:w="150" w:type="dxa"/>
+              <w:end w:w="170" w:type="dxa"/>
+            </w:tcMar>
+          </w:tcPr>
+          <w:p>
+            <w:pPr>
+              <w:spacing w:after="60"/>
+            </w:pPr>
+            <w:r>
+              <w:rPr>
+                <w:rFonts w:ascii="Microsoft YaHei" w:hAnsi="Microsoft YaHei" w:eastAsia="Microsoft YaHei"/>
+                <w:b/>
+                <w:color w:val="063F2A"/>
+                <w:sz w:val="21"/>
+              </w:rPr>
+              <w:t>无需产品激活</w:t>
+            </w:r>
+          </w:p>
+          <w:p>
+            <w:pPr>
+              <w:spacing w:after="0"/>
+            </w:pPr>
+            <w:r>
+              <w:rPr>
+                <w:rFonts w:ascii="Microsoft YaHei" w:hAnsi="Microsoft YaHei" w:eastAsia="Microsoft YaHei"/>
+                <w:color w:val="1A1F24"/>
+                <w:sz w:val="19"/>
+              </w:rPr>
+              <w:t>产品不设置产品序列号或激活码，HitRise 不会要求用户输入此类信息。云端资料使用 APP 自动生成的匿名用户标识，不影响本地训练。</w:t>
+            </w:r>
+          </w:p>
+        </w:tc>
+      </w:tr>
+    </w:tbl>
+    <w:p>
+      <w:pPr>
+        <w:spacing w:after="60"/>
+      </w:pPr>
+    </w:p>
+    <w:tbl>
+      <w:tblPr>
+        <w:tblW w:type="auto" w:w="0"/>
+        <w:jc w:val="center"/>
+        <w:tblLook w:firstColumn="1" w:firstRow="1" w:lastColumn="0" w:lastRow="0" w:noHBand="0" w:noVBand="1" w:val="04A0"/>
+      </w:tblPr>
+      <w:tblGrid>
+        <w:gridCol w:w="9978"/>
+      </w:tblGrid>
+      <w:tr>
+        <w:trPr>
+          <w:cantSplit/>
+        </w:trPr>
         <w:tc>
           <w:tcPr>
             <w:tcW w:type="dxa" w:w="9978"/>
@@ -1335,6 +1458,7 @@
     </w:p>
     <w:p>
       <w:pPr>
+        <w:keepNext/>
         <w:spacing w:before="160" w:after="100"/>
       </w:pPr>
       <w:r>
@@ -1454,6 +1578,7 @@
     </w:p>
     <w:p>
       <w:pPr>
+        <w:keepNext/>
         <w:spacing w:before="200" w:after="160"/>
       </w:pPr>
       <w:r>
@@ -1468,6 +1593,7 @@
     </w:p>
     <w:p>
       <w:pPr>
+        <w:keepNext/>
         <w:spacing w:before="160" w:after="100"/>
       </w:pPr>
       <w:r>
@@ -1538,6 +1664,7 @@
     </w:p>
     <w:p>
       <w:pPr>
+        <w:keepNext/>
         <w:spacing w:before="160" w:after="100"/>
       </w:pPr>
       <w:r>
@@ -1563,6 +1690,10 @@
         <w:gridCol w:w="3326"/>
       </w:tblGrid>
       <w:tr>
+        <w:trPr>
+          <w:cantSplit/>
+          <w:tblHeader w:val="true"/>
+        </w:trPr>
         <w:tc>
           <w:tcPr>
             <w:tcW w:type="dxa" w:w="1701"/>
@@ -1664,6 +1795,9 @@
         </w:tc>
       </w:tr>
       <w:tr>
+        <w:trPr>
+          <w:cantSplit/>
+        </w:trPr>
         <w:tc>
           <w:tcPr>
             <w:tcW w:type="dxa" w:w="1701"/>
@@ -1762,6 +1896,9 @@
         </w:tc>
       </w:tr>
       <w:tr>
+        <w:trPr>
+          <w:cantSplit/>
+        </w:trPr>
         <w:tc>
           <w:tcPr>
             <w:tcW w:type="dxa" w:w="1701"/>
@@ -1860,6 +1997,9 @@
         </w:tc>
       </w:tr>
       <w:tr>
+        <w:trPr>
+          <w:cantSplit/>
+        </w:trPr>
         <w:tc>
           <w:tcPr>
             <w:tcW w:type="dxa" w:w="1701"/>
@@ -1958,6 +2098,9 @@
         </w:tc>
       </w:tr>
       <w:tr>
+        <w:trPr>
+          <w:cantSplit/>
+        </w:trPr>
         <w:tc>
           <w:tcPr>
             <w:tcW w:type="dxa" w:w="1701"/>
@@ -2071,6 +2214,9 @@
         <w:gridCol w:w="9978"/>
       </w:tblGrid>
       <w:tr>
+        <w:trPr>
+          <w:cantSplit/>
+        </w:trPr>
         <w:tc>
           <w:tcPr>
             <w:tcW w:type="dxa" w:w="9978"/>
@@ -2125,6 +2271,7 @@
     </w:p>
     <w:p>
       <w:pPr>
+        <w:keepNext/>
         <w:spacing w:before="200" w:after="160"/>
       </w:pPr>
       <w:r>
@@ -2139,6 +2286,7 @@
     </w:p>
     <w:p>
       <w:pPr>
+        <w:keepNext/>
         <w:spacing w:before="160" w:after="100"/>
       </w:pPr>
       <w:r>
@@ -2209,6 +2357,7 @@
     </w:p>
     <w:p>
       <w:pPr>
+        <w:keepNext/>
         <w:spacing w:before="160" w:after="100"/>
       </w:pPr>
       <w:r>
@@ -2234,6 +2383,10 @@
         <w:gridCol w:w="3326"/>
       </w:tblGrid>
       <w:tr>
+        <w:trPr>
+          <w:cantSplit/>
+          <w:tblHeader w:val="true"/>
+        </w:trPr>
         <w:tc>
           <w:tcPr>
             <w:tcW w:type="dxa" w:w="1871"/>
@@ -2335,6 +2488,9 @@
         </w:tc>
       </w:tr>
       <w:tr>
+        <w:trPr>
+          <w:cantSplit/>
+        </w:trPr>
         <w:tc>
           <w:tcPr>
             <w:tcW w:type="dxa" w:w="1871"/>
@@ -2433,6 +2589,9 @@
         </w:tc>
       </w:tr>
       <w:tr>
+        <w:trPr>
+          <w:cantSplit/>
+        </w:trPr>
         <w:tc>
           <w:tcPr>
             <w:tcW w:type="dxa" w:w="1871"/>
@@ -2531,6 +2690,9 @@
         </w:tc>
       </w:tr>
       <w:tr>
+        <w:trPr>
+          <w:cantSplit/>
+        </w:trPr>
         <w:tc>
           <w:tcPr>
             <w:tcW w:type="dxa" w:w="1871"/>
@@ -2629,6 +2791,9 @@
         </w:tc>
       </w:tr>
       <w:tr>
+        <w:trPr>
+          <w:cantSplit/>
+        </w:trPr>
         <w:tc>
           <w:tcPr>
             <w:tcW w:type="dxa" w:w="1871"/>
@@ -2734,6 +2899,7 @@
     </w:p>
     <w:p>
       <w:pPr>
+        <w:keepNext/>
         <w:spacing w:before="160" w:after="100"/>
       </w:pPr>
       <w:r>
@@ -2808,6 +2974,7 @@
     </w:p>
     <w:p>
       <w:pPr>
+        <w:keepNext/>
         <w:spacing w:before="200" w:after="160"/>
       </w:pPr>
       <w:r>
@@ -2822,6 +2989,7 @@
     </w:p>
     <w:p>
       <w:pPr>
+        <w:keepNext/>
         <w:spacing w:before="160" w:after="100"/>
       </w:pPr>
       <w:r>
@@ -2847,6 +3015,10 @@
         <w:gridCol w:w="3326"/>
       </w:tblGrid>
       <w:tr>
+        <w:trPr>
+          <w:cantSplit/>
+          <w:tblHeader w:val="true"/>
+        </w:trPr>
         <w:tc>
           <w:tcPr>
             <w:tcW w:type="dxa" w:w="1814"/>
@@ -2948,6 +3120,9 @@
         </w:tc>
       </w:tr>
       <w:tr>
+        <w:trPr>
+          <w:cantSplit/>
+        </w:trPr>
         <w:tc>
           <w:tcPr>
             <w:tcW w:type="dxa" w:w="1814"/>
@@ -3046,6 +3221,9 @@
         </w:tc>
       </w:tr>
       <w:tr>
+        <w:trPr>
+          <w:cantSplit/>
+        </w:trPr>
         <w:tc>
           <w:tcPr>
             <w:tcW w:type="dxa" w:w="1814"/>
@@ -3144,6 +3322,9 @@
         </w:tc>
       </w:tr>
       <w:tr>
+        <w:trPr>
+          <w:cantSplit/>
+        </w:trPr>
         <w:tc>
           <w:tcPr>
             <w:tcW w:type="dxa" w:w="1814"/>
@@ -3242,6 +3423,9 @@
         </w:tc>
       </w:tr>
       <w:tr>
+        <w:trPr>
+          <w:cantSplit/>
+        </w:trPr>
         <w:tc>
           <w:tcPr>
             <w:tcW w:type="dxa" w:w="1814"/>
@@ -3340,6 +3524,9 @@
         </w:tc>
       </w:tr>
       <w:tr>
+        <w:trPr>
+          <w:cantSplit/>
+        </w:trPr>
         <w:tc>
           <w:tcPr>
             <w:tcW w:type="dxa" w:w="1814"/>
@@ -3438,6 +3625,9 @@
         </w:tc>
       </w:tr>
       <w:tr>
+        <w:trPr>
+          <w:cantSplit/>
+        </w:trPr>
         <w:tc>
           <w:tcPr>
             <w:tcW w:type="dxa" w:w="1814"/>
@@ -3543,6 +3733,7 @@
     </w:p>
     <w:p>
       <w:pPr>
+        <w:keepNext/>
         <w:spacing w:before="160" w:after="100"/>
       </w:pPr>
       <w:r>
@@ -3613,6 +3804,7 @@
     </w:p>
     <w:p>
       <w:pPr>
+        <w:keepNext/>
         <w:spacing w:before="160" w:after="100"/>
       </w:pPr>
       <w:r>
@@ -3672,6 +3864,7 @@
     </w:p>
     <w:p>
       <w:pPr>
+        <w:keepNext/>
         <w:spacing w:before="200" w:after="160"/>
       </w:pPr>
       <w:r>
@@ -3686,6 +3879,7 @@
     </w:p>
     <w:p>
       <w:pPr>
+        <w:keepNext/>
         <w:spacing w:before="160" w:after="100"/>
       </w:pPr>
       <w:r>
@@ -3711,6 +3905,10 @@
         <w:gridCol w:w="3326"/>
       </w:tblGrid>
       <w:tr>
+        <w:trPr>
+          <w:cantSplit/>
+          <w:tblHeader w:val="true"/>
+        </w:trPr>
         <w:tc>
           <w:tcPr>
             <w:tcW w:type="dxa" w:w="1757"/>
@@ -3812,6 +4010,9 @@
         </w:tc>
       </w:tr>
       <w:tr>
+        <w:trPr>
+          <w:cantSplit/>
+        </w:trPr>
         <w:tc>
           <w:tcPr>
             <w:tcW w:type="dxa" w:w="1757"/>
@@ -3910,6 +4111,9 @@
         </w:tc>
       </w:tr>
       <w:tr>
+        <w:trPr>
+          <w:cantSplit/>
+        </w:trPr>
         <w:tc>
           <w:tcPr>
             <w:tcW w:type="dxa" w:w="1757"/>
@@ -4008,6 +4212,9 @@
         </w:tc>
       </w:tr>
       <w:tr>
+        <w:trPr>
+          <w:cantSplit/>
+        </w:trPr>
         <w:tc>
           <w:tcPr>
             <w:tcW w:type="dxa" w:w="1757"/>
@@ -4106,6 +4313,9 @@
         </w:tc>
       </w:tr>
       <w:tr>
+        <w:trPr>
+          <w:cantSplit/>
+        </w:trPr>
         <w:tc>
           <w:tcPr>
             <w:tcW w:type="dxa" w:w="1757"/>
@@ -4204,6 +4414,9 @@
         </w:tc>
       </w:tr>
       <w:tr>
+        <w:trPr>
+          <w:cantSplit/>
+        </w:trPr>
         <w:tc>
           <w:tcPr>
             <w:tcW w:type="dxa" w:w="1757"/>
@@ -4264,7 +4477,7 @@
                 <w:color w:val="1A1F24"/>
                 <w:sz w:val="18"/>
               </w:rPr>
-              <w:t>40-140，5 BPM 步进</w:t>
+              <w:t>100-300，默认 100，5 BPM 步进</w:t>
             </w:r>
           </w:p>
         </w:tc>
@@ -4296,7 +4509,7 @@
                 <w:color w:val="1A1F24"/>
                 <w:sz w:val="18"/>
               </w:rPr>
-              <w:t>跟拍模式下用于节拍评分和训练律动。</w:t>
+              <w:t>保存值同时用于节拍评分和实际鼓点播放。</w:t>
             </w:r>
           </w:p>
         </w:tc>
@@ -4309,6 +4522,7 @@
     </w:p>
     <w:p>
       <w:pPr>
+        <w:keepNext/>
         <w:spacing w:before="160" w:after="100"/>
       </w:pPr>
       <w:r>
@@ -4319,6 +4533,21 @@
           <w:sz w:val="29"/>
         </w:rPr>
         <w:t>节拍评分</w:t>
+      </w:r>
+    </w:p>
+    <w:p>
+      <w:pPr>
+        <w:pStyle w:val="ListBullet"/>
+        <w:spacing w:after="60"/>
+        <w:ind w:left="255"/>
+      </w:pPr>
+      <w:r>
+        <w:rPr>
+          <w:rFonts w:ascii="Microsoft YaHei" w:hAnsi="Microsoft YaHei" w:eastAsia="Microsoft YaHei"/>
+          <w:color w:val="1A1F24"/>
+          <w:sz w:val="20"/>
+        </w:rPr>
+        <w:t>BPM 默认值为 100（热身节奏），最高可设为 300（极限节奏）；保存后显示值、评分节拍和鼓点播放速度保持一致。</w:t>
       </w:r>
     </w:p>
     <w:p>
@@ -4383,6 +4612,7 @@
     </w:p>
     <w:p>
       <w:pPr>
+        <w:keepNext/>
         <w:spacing w:before="160" w:after="100"/>
       </w:pPr>
       <w:r>
@@ -4456,7 +4686,13 @@
       </w:r>
     </w:p>
     <w:p>
+      <w:r>
+        <w:br w:type="page"/>
+      </w:r>
+    </w:p>
+    <w:p>
       <w:pPr>
+        <w:keepNext/>
         <w:spacing w:before="200" w:after="160"/>
       </w:pPr>
       <w:r>
@@ -4471,6 +4707,7 @@
     </w:p>
     <w:p>
       <w:pPr>
+        <w:keepNext/>
         <w:spacing w:before="160" w:after="100"/>
       </w:pPr>
       <w:r>
@@ -4495,6 +4732,10 @@
         <w:gridCol w:w="4989"/>
       </w:tblGrid>
       <w:tr>
+        <w:trPr>
+          <w:cantSplit/>
+          <w:tblHeader w:val="true"/>
+        </w:trPr>
         <w:tc>
           <w:tcPr>
             <w:tcW w:type="dxa" w:w="2381"/>
@@ -4563,6 +4804,9 @@
         </w:tc>
       </w:tr>
       <w:tr>
+        <w:trPr>
+          <w:cantSplit/>
+        </w:trPr>
         <w:tc>
           <w:tcPr>
             <w:tcW w:type="dxa" w:w="2381"/>
@@ -4629,6 +4873,9 @@
         </w:tc>
       </w:tr>
       <w:tr>
+        <w:trPr>
+          <w:cantSplit/>
+        </w:trPr>
         <w:tc>
           <w:tcPr>
             <w:tcW w:type="dxa" w:w="2381"/>
@@ -4695,6 +4942,9 @@
         </w:tc>
       </w:tr>
       <w:tr>
+        <w:trPr>
+          <w:cantSplit/>
+        </w:trPr>
         <w:tc>
           <w:tcPr>
             <w:tcW w:type="dxa" w:w="2381"/>
@@ -4761,6 +5011,9 @@
         </w:tc>
       </w:tr>
       <w:tr>
+        <w:trPr>
+          <w:cantSplit/>
+        </w:trPr>
         <w:tc>
           <w:tcPr>
             <w:tcW w:type="dxa" w:w="2381"/>
@@ -4827,6 +5080,9 @@
         </w:tc>
       </w:tr>
       <w:tr>
+        <w:trPr>
+          <w:cantSplit/>
+        </w:trPr>
         <w:tc>
           <w:tcPr>
             <w:tcW w:type="dxa" w:w="2381"/>
@@ -4893,6 +5149,9 @@
         </w:tc>
       </w:tr>
       <w:tr>
+        <w:trPr>
+          <w:cantSplit/>
+        </w:trPr>
         <w:tc>
           <w:tcPr>
             <w:tcW w:type="dxa" w:w="2381"/>
@@ -4959,6 +5218,9 @@
         </w:tc>
       </w:tr>
       <w:tr>
+        <w:trPr>
+          <w:cantSplit/>
+        </w:trPr>
         <w:tc>
           <w:tcPr>
             <w:tcW w:type="dxa" w:w="2381"/>
@@ -5032,6 +5294,7 @@
     </w:p>
     <w:p>
       <w:pPr>
+        <w:keepNext/>
         <w:spacing w:before="160" w:after="100"/>
       </w:pPr>
       <w:r>
@@ -5106,6 +5369,7 @@
     </w:p>
     <w:p>
       <w:pPr>
+        <w:keepNext/>
         <w:spacing w:before="200" w:after="160"/>
       </w:pPr>
       <w:r>
@@ -5120,6 +5384,7 @@
     </w:p>
     <w:p>
       <w:pPr>
+        <w:keepNext/>
         <w:spacing w:before="160" w:after="100"/>
       </w:pPr>
       <w:r>
@@ -5147,6 +5412,7 @@
     </w:p>
     <w:p>
       <w:pPr>
+        <w:keepNext/>
         <w:spacing w:before="160" w:after="100"/>
       </w:pPr>
       <w:r>
@@ -5171,6 +5437,10 @@
         <w:gridCol w:w="4989"/>
       </w:tblGrid>
       <w:tr>
+        <w:trPr>
+          <w:cantSplit/>
+          <w:tblHeader w:val="true"/>
+        </w:trPr>
         <w:tc>
           <w:tcPr>
             <w:tcW w:type="dxa" w:w="2381"/>
@@ -5239,6 +5509,9 @@
         </w:tc>
       </w:tr>
       <w:tr>
+        <w:trPr>
+          <w:cantSplit/>
+        </w:trPr>
         <w:tc>
           <w:tcPr>
             <w:tcW w:type="dxa" w:w="2381"/>
@@ -5305,6 +5578,9 @@
         </w:tc>
       </w:tr>
       <w:tr>
+        <w:trPr>
+          <w:cantSplit/>
+        </w:trPr>
         <w:tc>
           <w:tcPr>
             <w:tcW w:type="dxa" w:w="2381"/>
@@ -5371,6 +5647,9 @@
         </w:tc>
       </w:tr>
       <w:tr>
+        <w:trPr>
+          <w:cantSplit/>
+        </w:trPr>
         <w:tc>
           <w:tcPr>
             <w:tcW w:type="dxa" w:w="2381"/>
@@ -5437,6 +5716,9 @@
         </w:tc>
       </w:tr>
       <w:tr>
+        <w:trPr>
+          <w:cantSplit/>
+        </w:trPr>
         <w:tc>
           <w:tcPr>
             <w:tcW w:type="dxa" w:w="2381"/>
@@ -5503,6 +5785,9 @@
         </w:tc>
       </w:tr>
       <w:tr>
+        <w:trPr>
+          <w:cantSplit/>
+        </w:trPr>
         <w:tc>
           <w:tcPr>
             <w:tcW w:type="dxa" w:w="2381"/>
@@ -5569,6 +5854,9 @@
         </w:tc>
       </w:tr>
       <w:tr>
+        <w:trPr>
+          <w:cantSplit/>
+        </w:trPr>
         <w:tc>
           <w:tcPr>
             <w:tcW w:type="dxa" w:w="2381"/>
@@ -5642,6 +5930,7 @@
     </w:p>
     <w:p>
       <w:pPr>
+        <w:keepNext/>
         <w:spacing w:before="160" w:after="100"/>
       </w:pPr>
       <w:r>
@@ -5666,7 +5955,7 @@
           <w:color w:val="1A1F24"/>
           <w:sz w:val="20"/>
         </w:rPr>
-        <w:t>查看昵称、头像、地区、语言和训练概览。</w:t>
+        <w:t>查看昵称、头像、地区、语言、匿名用户编号和训练概览；匿名用户编号不是产品序列号。</w:t>
       </w:r>
     </w:p>
     <w:p>
@@ -5716,6 +6005,7 @@
     </w:p>
     <w:p>
       <w:pPr>
+        <w:keepNext/>
         <w:spacing w:before="200" w:after="160"/>
       </w:pPr>
       <w:r>
@@ -5730,6 +6020,7 @@
     </w:p>
     <w:p>
       <w:pPr>
+        <w:keepNext/>
         <w:spacing w:before="160" w:after="100"/>
       </w:pPr>
       <w:r>
@@ -5757,6 +6048,7 @@
     </w:p>
     <w:p>
       <w:pPr>
+        <w:keepNext/>
         <w:spacing w:before="160" w:after="100"/>
       </w:pPr>
       <w:r>
@@ -5784,6 +6076,7 @@
     </w:p>
     <w:p>
       <w:pPr>
+        <w:keepNext/>
         <w:spacing w:before="160" w:after="100"/>
       </w:pPr>
       <w:r>
@@ -5809,6 +6102,10 @@
         <w:gridCol w:w="3326"/>
       </w:tblGrid>
       <w:tr>
+        <w:trPr>
+          <w:cantSplit/>
+          <w:tblHeader w:val="true"/>
+        </w:trPr>
         <w:tc>
           <w:tcPr>
             <w:tcW w:type="dxa" w:w="1871"/>
@@ -5910,6 +6207,9 @@
         </w:tc>
       </w:tr>
       <w:tr>
+        <w:trPr>
+          <w:cantSplit/>
+        </w:trPr>
         <w:tc>
           <w:tcPr>
             <w:tcW w:type="dxa" w:w="1871"/>
@@ -6008,6 +6308,9 @@
         </w:tc>
       </w:tr>
       <w:tr>
+        <w:trPr>
+          <w:cantSplit/>
+        </w:trPr>
         <w:tc>
           <w:tcPr>
             <w:tcW w:type="dxa" w:w="1871"/>
@@ -6106,6 +6409,9 @@
         </w:tc>
       </w:tr>
       <w:tr>
+        <w:trPr>
+          <w:cantSplit/>
+        </w:trPr>
         <w:tc>
           <w:tcPr>
             <w:tcW w:type="dxa" w:w="1871"/>
@@ -6219,6 +6525,9 @@
         <w:gridCol w:w="9978"/>
       </w:tblGrid>
       <w:tr>
+        <w:trPr>
+          <w:cantSplit/>
+        </w:trPr>
         <w:tc>
           <w:tcPr>
             <w:tcW w:type="dxa" w:w="9978"/>
@@ -6273,6 +6582,7 @@
     </w:p>
     <w:p>
       <w:pPr>
+        <w:keepNext/>
         <w:spacing w:before="200" w:after="160"/>
       </w:pPr>
       <w:r>
@@ -6287,6 +6597,7 @@
     </w:p>
     <w:p>
       <w:pPr>
+        <w:keepNext/>
         <w:spacing w:before="160" w:after="100"/>
       </w:pPr>
       <w:r>
@@ -6361,6 +6672,7 @@
     </w:p>
     <w:p>
       <w:pPr>
+        <w:keepNext/>
         <w:spacing w:before="160" w:after="100"/>
       </w:pPr>
       <w:r>
@@ -6385,6 +6697,10 @@
         <w:gridCol w:w="4989"/>
       </w:tblGrid>
       <w:tr>
+        <w:trPr>
+          <w:cantSplit/>
+          <w:tblHeader w:val="true"/>
+        </w:trPr>
         <w:tc>
           <w:tcPr>
             <w:tcW w:type="dxa" w:w="2268"/>
@@ -6396,9 +6712,9 @@
               <w:right w:val="single" w:sz="6" w:space="0" w:color="C9D4DA"/>
             </w:tcBorders>
             <w:tcMar>
-              <w:top w:w="130" w:type="dxa"/>
+              <w:top w:w="90" w:type="dxa"/>
               <w:start w:w="130" w:type="dxa"/>
-              <w:bottom w:w="130" w:type="dxa"/>
+              <w:bottom w:w="90" w:type="dxa"/>
               <w:end w:w="130" w:type="dxa"/>
             </w:tcMar>
             <w:vAlign w:val="center"/>
@@ -6429,9 +6745,9 @@
               <w:right w:val="single" w:sz="6" w:space="0" w:color="C9D4DA"/>
             </w:tcBorders>
             <w:tcMar>
-              <w:top w:w="130" w:type="dxa"/>
+              <w:top w:w="90" w:type="dxa"/>
               <w:start w:w="130" w:type="dxa"/>
-              <w:bottom w:w="130" w:type="dxa"/>
+              <w:bottom w:w="90" w:type="dxa"/>
               <w:end w:w="130" w:type="dxa"/>
             </w:tcMar>
             <w:vAlign w:val="center"/>
@@ -6453,6 +6769,9 @@
         </w:tc>
       </w:tr>
       <w:tr>
+        <w:trPr>
+          <w:cantSplit/>
+        </w:trPr>
         <w:tc>
           <w:tcPr>
             <w:tcW w:type="dxa" w:w="2268"/>
@@ -6464,9 +6783,9 @@
               <w:right w:val="single" w:sz="6" w:space="0" w:color="D6DEE4"/>
             </w:tcBorders>
             <w:tcMar>
-              <w:top w:w="120" w:type="dxa"/>
+              <w:top w:w="80" w:type="dxa"/>
               <w:start w:w="130" w:type="dxa"/>
-              <w:bottom w:w="120" w:type="dxa"/>
+              <w:bottom w:w="80" w:type="dxa"/>
               <w:end w:w="130" w:type="dxa"/>
             </w:tcMar>
             <w:vAlign w:val="center"/>
@@ -6496,9 +6815,9 @@
               <w:right w:val="single" w:sz="6" w:space="0" w:color="D6DEE4"/>
             </w:tcBorders>
             <w:tcMar>
-              <w:top w:w="120" w:type="dxa"/>
+              <w:top w:w="80" w:type="dxa"/>
               <w:start w:w="130" w:type="dxa"/>
-              <w:bottom w:w="120" w:type="dxa"/>
+              <w:bottom w:w="80" w:type="dxa"/>
               <w:end w:w="130" w:type="dxa"/>
             </w:tcMar>
             <w:vAlign w:val="center"/>
@@ -6519,6 +6838,9 @@
         </w:tc>
       </w:tr>
       <w:tr>
+        <w:trPr>
+          <w:cantSplit/>
+        </w:trPr>
         <w:tc>
           <w:tcPr>
             <w:tcW w:type="dxa" w:w="2268"/>
@@ -6530,9 +6852,9 @@
               <w:right w:val="single" w:sz="6" w:space="0" w:color="D6DEE4"/>
             </w:tcBorders>
             <w:tcMar>
-              <w:top w:w="120" w:type="dxa"/>
+              <w:top w:w="80" w:type="dxa"/>
               <w:start w:w="130" w:type="dxa"/>
-              <w:bottom w:w="120" w:type="dxa"/>
+              <w:bottom w:w="80" w:type="dxa"/>
               <w:end w:w="130" w:type="dxa"/>
             </w:tcMar>
             <w:vAlign w:val="center"/>
@@ -6562,9 +6884,9 @@
               <w:right w:val="single" w:sz="6" w:space="0" w:color="D6DEE4"/>
             </w:tcBorders>
             <w:tcMar>
-              <w:top w:w="120" w:type="dxa"/>
+              <w:top w:w="80" w:type="dxa"/>
               <w:start w:w="130" w:type="dxa"/>
-              <w:bottom w:w="120" w:type="dxa"/>
+              <w:bottom w:w="80" w:type="dxa"/>
               <w:end w:w="130" w:type="dxa"/>
             </w:tcMar>
             <w:vAlign w:val="center"/>
@@ -6585,6 +6907,9 @@
         </w:tc>
       </w:tr>
       <w:tr>
+        <w:trPr>
+          <w:cantSplit/>
+        </w:trPr>
         <w:tc>
           <w:tcPr>
             <w:tcW w:type="dxa" w:w="2268"/>
@@ -6596,9 +6921,9 @@
               <w:right w:val="single" w:sz="6" w:space="0" w:color="D6DEE4"/>
             </w:tcBorders>
             <w:tcMar>
-              <w:top w:w="120" w:type="dxa"/>
+              <w:top w:w="80" w:type="dxa"/>
               <w:start w:w="130" w:type="dxa"/>
-              <w:bottom w:w="120" w:type="dxa"/>
+              <w:bottom w:w="80" w:type="dxa"/>
               <w:end w:w="130" w:type="dxa"/>
             </w:tcMar>
             <w:vAlign w:val="center"/>
@@ -6628,9 +6953,9 @@
               <w:right w:val="single" w:sz="6" w:space="0" w:color="D6DEE4"/>
             </w:tcBorders>
             <w:tcMar>
-              <w:top w:w="120" w:type="dxa"/>
+              <w:top w:w="80" w:type="dxa"/>
               <w:start w:w="130" w:type="dxa"/>
-              <w:bottom w:w="120" w:type="dxa"/>
+              <w:bottom w:w="80" w:type="dxa"/>
               <w:end w:w="130" w:type="dxa"/>
             </w:tcMar>
             <w:vAlign w:val="center"/>
@@ -6651,6 +6976,9 @@
         </w:tc>
       </w:tr>
       <w:tr>
+        <w:trPr>
+          <w:cantSplit/>
+        </w:trPr>
         <w:tc>
           <w:tcPr>
             <w:tcW w:type="dxa" w:w="2268"/>
@@ -6662,9 +6990,78 @@
               <w:right w:val="single" w:sz="6" w:space="0" w:color="D6DEE4"/>
             </w:tcBorders>
             <w:tcMar>
-              <w:top w:w="120" w:type="dxa"/>
+              <w:top w:w="80" w:type="dxa"/>
               <w:start w:w="130" w:type="dxa"/>
-              <w:bottom w:w="120" w:type="dxa"/>
+              <w:bottom w:w="80" w:type="dxa"/>
+              <w:end w:w="130" w:type="dxa"/>
+            </w:tcMar>
+            <w:vAlign w:val="center"/>
+          </w:tcPr>
+          <w:p>
+            <w:pPr>
+              <w:jc w:val="center"/>
+            </w:pPr>
+            <w:r>
+              <w:rPr>
+                <w:rFonts w:ascii="Microsoft YaHei" w:hAnsi="Microsoft YaHei" w:eastAsia="Microsoft YaHei"/>
+                <w:color w:val="1A1F24"/>
+                <w:sz w:val="18"/>
+              </w:rPr>
+              <w:t>倒计时语音与画面不一致</w:t>
+            </w:r>
+          </w:p>
+        </w:tc>
+        <w:tc>
+          <w:tcPr>
+            <w:tcW w:type="dxa" w:w="6123"/>
+            <w:shd w:fill="FFFFFF"/>
+            <w:tcBorders>
+              <w:top w:val="single" w:sz="6" w:space="0" w:color="D6DEE4"/>
+              <w:left w:val="single" w:sz="6" w:space="0" w:color="D6DEE4"/>
+              <w:bottom w:val="single" w:sz="6" w:space="0" w:color="D6DEE4"/>
+              <w:right w:val="single" w:sz="6" w:space="0" w:color="D6DEE4"/>
+            </w:tcBorders>
+            <w:tcMar>
+              <w:top w:w="80" w:type="dxa"/>
+              <w:start w:w="130" w:type="dxa"/>
+              <w:bottom w:w="80" w:type="dxa"/>
+              <w:end w:w="130" w:type="dxa"/>
+            </w:tcMar>
+            <w:vAlign w:val="center"/>
+          </w:tcPr>
+          <w:p>
+            <w:pPr>
+              <w:jc w:val="left"/>
+            </w:pPr>
+            <w:r>
+              <w:rPr>
+                <w:rFonts w:ascii="Microsoft YaHei" w:hAnsi="Microsoft YaHei" w:eastAsia="Microsoft YaHei"/>
+                <w:color w:val="1A1F24"/>
+                <w:sz w:val="18"/>
+              </w:rPr>
+              <w:t>请更新到最新版本；新版本会按触发时的实际剩余秒数播报。</w:t>
+            </w:r>
+          </w:p>
+        </w:tc>
+      </w:tr>
+      <w:tr>
+        <w:trPr>
+          <w:cantSplit/>
+        </w:trPr>
+        <w:tc>
+          <w:tcPr>
+            <w:tcW w:type="dxa" w:w="2268"/>
+            <w:shd w:fill="FFFFFF"/>
+            <w:tcBorders>
+              <w:top w:val="single" w:sz="6" w:space="0" w:color="D6DEE4"/>
+              <w:left w:val="single" w:sz="6" w:space="0" w:color="D6DEE4"/>
+              <w:bottom w:val="single" w:sz="6" w:space="0" w:color="D6DEE4"/>
+              <w:right w:val="single" w:sz="6" w:space="0" w:color="D6DEE4"/>
+            </w:tcBorders>
+            <w:tcMar>
+              <w:top w:w="80" w:type="dxa"/>
+              <w:start w:w="130" w:type="dxa"/>
+              <w:bottom w:w="80" w:type="dxa"/>
               <w:end w:w="130" w:type="dxa"/>
             </w:tcMar>
             <w:vAlign w:val="center"/>
@@ -6694,9 +7091,9 @@
               <w:right w:val="single" w:sz="6" w:space="0" w:color="D6DEE4"/>
             </w:tcBorders>
             <w:tcMar>
-              <w:top w:w="120" w:type="dxa"/>
+              <w:top w:w="80" w:type="dxa"/>
               <w:start w:w="130" w:type="dxa"/>
-              <w:bottom w:w="120" w:type="dxa"/>
+              <w:bottom w:w="80" w:type="dxa"/>
               <w:end w:w="130" w:type="dxa"/>
             </w:tcMar>
             <w:vAlign w:val="center"/>
@@ -6717,6 +7114,9 @@
         </w:tc>
       </w:tr>
       <w:tr>
+        <w:trPr>
+          <w:cantSplit/>
+        </w:trPr>
         <w:tc>
           <w:tcPr>
             <w:tcW w:type="dxa" w:w="2268"/>
@@ -6728,9 +7128,9 @@
               <w:right w:val="single" w:sz="6" w:space="0" w:color="D6DEE4"/>
             </w:tcBorders>
             <w:tcMar>
-              <w:top w:w="120" w:type="dxa"/>
+              <w:top w:w="80" w:type="dxa"/>
               <w:start w:w="130" w:type="dxa"/>
-              <w:bottom w:w="120" w:type="dxa"/>
+              <w:bottom w:w="80" w:type="dxa"/>
               <w:end w:w="130" w:type="dxa"/>
             </w:tcMar>
             <w:vAlign w:val="center"/>
@@ -6760,9 +7160,9 @@
               <w:right w:val="single" w:sz="6" w:space="0" w:color="D6DEE4"/>
             </w:tcBorders>
             <w:tcMar>
-              <w:top w:w="120" w:type="dxa"/>
+              <w:top w:w="80" w:type="dxa"/>
               <w:start w:w="130" w:type="dxa"/>
-              <w:bottom w:w="120" w:type="dxa"/>
+              <w:bottom w:w="80" w:type="dxa"/>
               <w:end w:w="130" w:type="dxa"/>
             </w:tcMar>
             <w:vAlign w:val="center"/>
@@ -6783,6 +7183,9 @@
         </w:tc>
       </w:tr>
       <w:tr>
+        <w:trPr>
+          <w:cantSplit/>
+        </w:trPr>
         <w:tc>
           <w:tcPr>
             <w:tcW w:type="dxa" w:w="2268"/>
@@ -6794,9 +7197,9 @@
               <w:right w:val="single" w:sz="6" w:space="0" w:color="D6DEE4"/>
             </w:tcBorders>
             <w:tcMar>
-              <w:top w:w="120" w:type="dxa"/>
+              <w:top w:w="80" w:type="dxa"/>
               <w:start w:w="130" w:type="dxa"/>
-              <w:bottom w:w="120" w:type="dxa"/>
+              <w:bottom w:w="80" w:type="dxa"/>
               <w:end w:w="130" w:type="dxa"/>
             </w:tcMar>
             <w:vAlign w:val="center"/>
@@ -6826,9 +7229,9 @@
               <w:right w:val="single" w:sz="6" w:space="0" w:color="D6DEE4"/>
             </w:tcBorders>
             <w:tcMar>
-              <w:top w:w="120" w:type="dxa"/>
+              <w:top w:w="80" w:type="dxa"/>
               <w:start w:w="130" w:type="dxa"/>
-              <w:bottom w:w="120" w:type="dxa"/>
+              <w:bottom w:w="80" w:type="dxa"/>
               <w:end w:w="130" w:type="dxa"/>
             </w:tcMar>
             <w:vAlign w:val="center"/>
@@ -6849,6 +7252,9 @@
         </w:tc>
       </w:tr>
       <w:tr>
+        <w:trPr>
+          <w:cantSplit/>
+        </w:trPr>
         <w:tc>
           <w:tcPr>
             <w:tcW w:type="dxa" w:w="2268"/>
@@ -6860,9 +7266,9 @@
               <w:right w:val="single" w:sz="6" w:space="0" w:color="D6DEE4"/>
             </w:tcBorders>
             <w:tcMar>
-              <w:top w:w="120" w:type="dxa"/>
+              <w:top w:w="80" w:type="dxa"/>
               <w:start w:w="130" w:type="dxa"/>
-              <w:bottom w:w="120" w:type="dxa"/>
+              <w:bottom w:w="80" w:type="dxa"/>
               <w:end w:w="130" w:type="dxa"/>
             </w:tcMar>
             <w:vAlign w:val="center"/>
@@ -6892,9 +7298,9 @@
               <w:right w:val="single" w:sz="6" w:space="0" w:color="D6DEE4"/>
             </w:tcBorders>
             <w:tcMar>
-              <w:top w:w="120" w:type="dxa"/>
+              <w:top w:w="80" w:type="dxa"/>
               <w:start w:w="130" w:type="dxa"/>
-              <w:bottom w:w="120" w:type="dxa"/>
+              <w:bottom w:w="80" w:type="dxa"/>
               <w:end w:w="130" w:type="dxa"/>
             </w:tcMar>
             <w:vAlign w:val="center"/>
@@ -6930,6 +7336,9 @@
         <w:gridCol w:w="9978"/>
       </w:tblGrid>
       <w:tr>
+        <w:trPr>
+          <w:cantSplit/>
+        </w:trPr>
         <w:tc>
           <w:tcPr>
             <w:tcW w:type="dxa" w:w="9978"/>
@@ -6986,7 +7395,7 @@
       <w:headerReference w:type="default" r:id="rId9"/>
       <w:footerReference w:type="default" r:id="rId10"/>
       <w:pgSz w:w="11906" w:h="16838"/>
-      <w:pgMar w:top="1020" w:right="964" w:bottom="1020" w:left="964" w:header="720" w:footer="720" w:gutter="0"/>
+      <w:pgMar w:top="1247" w:right="964" w:bottom="1020" w:left="964" w:header="720" w:footer="720" w:gutter="0"/>
       <w:cols w:space="720"/>
       <w:docGrid w:linePitch="360"/>
     </w:sectPr>

</xml_diff>